<commit_message>
Register R#20, R#21 Modified
R#20, R#21 のビットマップを変更
</commit_message>
<xml_diff>
--- a/fpga/V9968_Cartridge_TangNano20K/src/v9968/manual/v9968_programmers_manual_register_map.docx
+++ b/fpga/V9968_Cartridge_TangNano20K/src/v9968/manual/v9968_programmers_manual_register_map.docx
@@ -162,7 +162,7 @@
           <w:tab w:val="right" w:leader="dot" w:pos="9637"/>
         </w:tabs>
       </w:pPr>
-      <w:hyperlink r:id="rId6" w:history="1">
+      <w:hyperlink w:anchor="__RefHeading___Toc210_761562591" w:history="1">
         <w:r>
           <w:t>はじめに</w:t>
         </w:r>
@@ -180,7 +180,7 @@
           <w:tab w:val="right" w:leader="dot" w:pos="9637"/>
         </w:tabs>
       </w:pPr>
-      <w:hyperlink r:id="rId7" w:history="1">
+      <w:hyperlink w:anchor="__RefHeading___Toc212_761562591" w:history="1">
         <w:r>
           <w:t>コントロールレジスタ</w:t>
         </w:r>
@@ -198,7 +198,7 @@
           <w:tab w:val="right" w:leader="dot" w:pos="9637"/>
         </w:tabs>
       </w:pPr>
-      <w:hyperlink r:id="rId8" w:history="1">
+      <w:hyperlink w:anchor="__RefHeading___Toc214_761562591" w:history="1">
         <w:r>
           <w:t>R#0 Mode0</w:t>
         </w:r>
@@ -216,7 +216,7 @@
           <w:tab w:val="right" w:leader="dot" w:pos="9637"/>
         </w:tabs>
       </w:pPr>
-      <w:hyperlink r:id="rId9" w:history="1">
+      <w:hyperlink w:anchor="__RefHeading___Toc272_2656764749" w:history="1">
         <w:r>
           <w:t>R#1 Mode1</w:t>
         </w:r>
@@ -234,7 +234,7 @@
           <w:tab w:val="right" w:leader="dot" w:pos="9637"/>
         </w:tabs>
       </w:pPr>
-      <w:hyperlink r:id="rId10" w:history="1">
+      <w:hyperlink w:anchor="__RefHeading___Toc288_2656764749" w:history="1">
         <w:r>
           <w:t>R#2 Pattern Name Table Address</w:t>
         </w:r>
@@ -252,7 +252,7 @@
           <w:tab w:val="right" w:leader="dot" w:pos="9637"/>
         </w:tabs>
       </w:pPr>
-      <w:hyperlink r:id="rId11" w:history="1">
+      <w:hyperlink w:anchor="__RefHeading___Toc290_2656764749" w:history="1">
         <w:r>
           <w:t>R#3 Color Table Address (L)</w:t>
         </w:r>
@@ -270,7 +270,7 @@
           <w:tab w:val="right" w:leader="dot" w:pos="9637"/>
         </w:tabs>
       </w:pPr>
-      <w:hyperlink r:id="rId12" w:history="1">
+      <w:hyperlink w:anchor="__RefHeading___Toc292_2656764749" w:history="1">
         <w:r>
           <w:t>R#4 Pattern Generator Table Address</w:t>
         </w:r>
@@ -288,7 +288,7 @@
           <w:tab w:val="right" w:leader="dot" w:pos="9637"/>
         </w:tabs>
       </w:pPr>
-      <w:hyperlink r:id="rId13" w:history="1">
+      <w:hyperlink w:anchor="__RefHeading___Toc294_2656764749" w:history="1">
         <w:r>
           <w:t>R#5 Sprite Attribute Table Address (L)</w:t>
         </w:r>
@@ -306,7 +306,7 @@
           <w:tab w:val="right" w:leader="dot" w:pos="9637"/>
         </w:tabs>
       </w:pPr>
-      <w:hyperlink r:id="rId14" w:history="1">
+      <w:hyperlink w:anchor="__RefHeading___Toc296_2656764749" w:history="1">
         <w:r>
           <w:t>R#6 Sprite Pattern Generator Table Address</w:t>
         </w:r>
@@ -324,7 +324,7 @@
           <w:tab w:val="right" w:leader="dot" w:pos="9637"/>
         </w:tabs>
       </w:pPr>
-      <w:hyperlink r:id="rId15" w:history="1">
+      <w:hyperlink w:anchor="__RefHeading___Toc298_2656764749" w:history="1">
         <w:r>
           <w:t>R#7 Background Color</w:t>
         </w:r>
@@ -342,7 +342,7 @@
           <w:tab w:val="right" w:leader="dot" w:pos="9637"/>
         </w:tabs>
       </w:pPr>
-      <w:hyperlink r:id="rId16" w:history="1">
+      <w:hyperlink w:anchor="__RefHeading___Toc300_2656764749" w:history="1">
         <w:r>
           <w:t>R#8 Mode2</w:t>
         </w:r>
@@ -360,7 +360,7 @@
           <w:tab w:val="right" w:leader="dot" w:pos="9637"/>
         </w:tabs>
       </w:pPr>
-      <w:hyperlink r:id="rId17" w:history="1">
+      <w:hyperlink w:anchor="__RefHeading___Toc302_2656764749" w:history="1">
         <w:r>
           <w:t>R#9 Mode3</w:t>
         </w:r>
@@ -378,7 +378,7 @@
           <w:tab w:val="right" w:leader="dot" w:pos="9637"/>
         </w:tabs>
       </w:pPr>
-      <w:hyperlink r:id="rId18" w:history="1">
+      <w:hyperlink w:anchor="__RefHeading___Toc304_2656764749" w:history="1">
         <w:r>
           <w:t>R#10 Color Table Address (H)</w:t>
         </w:r>
@@ -396,7 +396,7 @@
           <w:tab w:val="right" w:leader="dot" w:pos="9637"/>
         </w:tabs>
       </w:pPr>
-      <w:hyperlink r:id="rId19" w:history="1">
+      <w:hyperlink w:anchor="__RefHeading___Toc306_2656764749" w:history="1">
         <w:r>
           <w:t>R#11 Sprite Attribute Table Address (H)</w:t>
         </w:r>
@@ -414,7 +414,7 @@
           <w:tab w:val="right" w:leader="dot" w:pos="9637"/>
         </w:tabs>
       </w:pPr>
-      <w:hyperlink r:id="rId20" w:history="1">
+      <w:hyperlink w:anchor="__RefHeading___Toc308_2656764749" w:history="1">
         <w:r>
           <w:t>R#12 Text Color/Back Color Register</w:t>
         </w:r>
@@ -432,7 +432,7 @@
           <w:tab w:val="right" w:leader="dot" w:pos="9637"/>
         </w:tabs>
       </w:pPr>
-      <w:hyperlink r:id="rId21" w:history="1">
+      <w:hyperlink w:anchor="__RefHeading___Toc310_2656764749" w:history="1">
         <w:r>
           <w:t>R#13 Blinking Period Register</w:t>
         </w:r>
@@ -450,7 +450,7 @@
           <w:tab w:val="right" w:leader="dot" w:pos="9637"/>
         </w:tabs>
       </w:pPr>
-      <w:hyperlink r:id="rId22" w:history="1">
+      <w:hyperlink w:anchor="__RefHeading___Toc312_2656764749" w:history="1">
         <w:r>
           <w:t>R#14 VRAM Access Base Address Register</w:t>
         </w:r>
@@ -468,7 +468,7 @@
           <w:tab w:val="right" w:leader="dot" w:pos="9637"/>
         </w:tabs>
       </w:pPr>
-      <w:hyperlink r:id="rId23" w:history="1">
+      <w:hyperlink w:anchor="__RefHeading___Toc314_2656764749" w:history="1">
         <w:r>
           <w:t>R#15 Status Register Pointer</w:t>
         </w:r>
@@ -486,7 +486,7 @@
           <w:tab w:val="right" w:leader="dot" w:pos="9637"/>
         </w:tabs>
       </w:pPr>
-      <w:hyperlink r:id="rId24" w:history="1">
+      <w:hyperlink w:anchor="__RefHeading___Toc316_2656764749" w:history="1">
         <w:r>
           <w:t>R#16 Color Palette Pointer</w:t>
         </w:r>
@@ -504,7 +504,7 @@
           <w:tab w:val="right" w:leader="dot" w:pos="9637"/>
         </w:tabs>
       </w:pPr>
-      <w:hyperlink r:id="rId25" w:history="1">
+      <w:hyperlink w:anchor="__RefHeading___Toc318_2656764749" w:history="1">
         <w:r>
           <w:t>R#17 Control Register Pointer</w:t>
         </w:r>
@@ -522,7 +522,7 @@
           <w:tab w:val="right" w:leader="dot" w:pos="9637"/>
         </w:tabs>
       </w:pPr>
-      <w:hyperlink r:id="rId26" w:history="1">
+      <w:hyperlink w:anchor="__RefHeading___Toc320_2656764749" w:history="1">
         <w:r>
           <w:t>R#18 Display Adjust Register</w:t>
         </w:r>
@@ -540,7 +540,7 @@
           <w:tab w:val="right" w:leader="dot" w:pos="9637"/>
         </w:tabs>
       </w:pPr>
-      <w:hyperlink r:id="rId27" w:history="1">
+      <w:hyperlink w:anchor="__RefHeading___Toc322_2656764749" w:history="1">
         <w:r>
           <w:t>R#19 Interrupt Line Register</w:t>
         </w:r>
@@ -558,7 +558,7 @@
           <w:tab w:val="right" w:leader="dot" w:pos="9637"/>
         </w:tabs>
       </w:pPr>
-      <w:hyperlink r:id="rId28" w:history="1">
+      <w:hyperlink w:anchor="__RefHeading___Toc324_2656764749" w:history="1">
         <w:r>
           <w:t>R#20 Mode5</w:t>
         </w:r>
@@ -576,7 +576,7 @@
           <w:tab w:val="right" w:leader="dot" w:pos="9637"/>
         </w:tabs>
       </w:pPr>
-      <w:hyperlink r:id="rId29" w:history="1">
+      <w:hyperlink w:anchor="__RefHeading___Toc326_2656764749" w:history="1">
         <w:r>
           <w:t>R#21 Mode6</w:t>
         </w:r>
@@ -594,7 +594,7 @@
           <w:tab w:val="right" w:leader="dot" w:pos="9637"/>
         </w:tabs>
       </w:pPr>
-      <w:hyperlink r:id="rId30" w:history="1">
+      <w:hyperlink w:anchor="__RefHeading___Toc328_2656764749" w:history="1">
         <w:r>
           <w:t>R#22 N/A</w:t>
         </w:r>
@@ -612,7 +612,7 @@
           <w:tab w:val="right" w:leader="dot" w:pos="9637"/>
         </w:tabs>
       </w:pPr>
-      <w:hyperlink r:id="rId31" w:history="1">
+      <w:hyperlink w:anchor="__RefHeading___Toc330_2656764749" w:history="1">
         <w:r>
           <w:t>R#23 Display Offset Register</w:t>
         </w:r>
@@ -630,7 +630,7 @@
           <w:tab w:val="right" w:leader="dot" w:pos="9637"/>
         </w:tabs>
       </w:pPr>
-      <w:hyperlink r:id="rId32" w:history="1">
+      <w:hyperlink w:anchor="__RefHeading___Toc332_2656764749" w:history="1">
         <w:r>
           <w:t>R#24 N/A</w:t>
         </w:r>
@@ -648,7 +648,7 @@
           <w:tab w:val="right" w:leader="dot" w:pos="9637"/>
         </w:tabs>
       </w:pPr>
-      <w:hyperlink r:id="rId33" w:history="1">
+      <w:hyperlink w:anchor="__RefHeading___Toc334_2656764749" w:history="1">
         <w:r>
           <w:t>R#25 Mode4</w:t>
         </w:r>
@@ -666,7 +666,7 @@
           <w:tab w:val="right" w:leader="dot" w:pos="9637"/>
         </w:tabs>
       </w:pPr>
-      <w:hyperlink r:id="rId34" w:history="1">
+      <w:hyperlink w:anchor="__RefHeading___Toc336_2656764749" w:history="1">
         <w:r>
           <w:t>R#26 Horizontal Offset Register (By Character Units)</w:t>
         </w:r>
@@ -684,7 +684,7 @@
           <w:tab w:val="right" w:leader="dot" w:pos="9637"/>
         </w:tabs>
       </w:pPr>
-      <w:hyperlink r:id="rId35" w:history="1">
+      <w:hyperlink w:anchor="__RefHeading___Toc338_2656764749" w:history="1">
         <w:r>
           <w:t>R#27 Horizontal Offset Register (By Dot Units)</w:t>
         </w:r>
@@ -702,7 +702,7 @@
           <w:tab w:val="right" w:leader="dot" w:pos="9637"/>
         </w:tabs>
       </w:pPr>
-      <w:hyperlink r:id="rId36" w:history="1">
+      <w:hyperlink w:anchor="__RefHeading___Toc340_2656764749" w:history="1">
         <w:r>
           <w:t>コマンドレジスタ</w:t>
         </w:r>
@@ -720,7 +720,7 @@
           <w:tab w:val="right" w:leader="dot" w:pos="9637"/>
         </w:tabs>
       </w:pPr>
-      <w:hyperlink r:id="rId37" w:history="1">
+      <w:hyperlink w:anchor="__RefHeading___Toc342_2656764749" w:history="1">
         <w:r>
           <w:t>R#32, R#33 Source X Register</w:t>
         </w:r>
@@ -738,7 +738,7 @@
           <w:tab w:val="right" w:leader="dot" w:pos="9637"/>
         </w:tabs>
       </w:pPr>
-      <w:hyperlink r:id="rId38" w:history="1">
+      <w:hyperlink w:anchor="__RefHeading___Toc344_2656764749" w:history="1">
         <w:r>
           <w:t>R#34, R#35 Source Y Register</w:t>
         </w:r>
@@ -756,7 +756,7 @@
           <w:tab w:val="right" w:leader="dot" w:pos="9637"/>
         </w:tabs>
       </w:pPr>
-      <w:hyperlink r:id="rId39" w:history="1">
+      <w:hyperlink w:anchor="__RefHeading___Toc346_2656764749" w:history="1">
         <w:r>
           <w:t>R#36, R#37 Destination X Register</w:t>
         </w:r>
@@ -774,7 +774,7 @@
           <w:tab w:val="right" w:leader="dot" w:pos="9637"/>
         </w:tabs>
       </w:pPr>
-      <w:hyperlink r:id="rId40" w:history="1">
+      <w:hyperlink w:anchor="__RefHeading___Toc348_2656764749" w:history="1">
         <w:r>
           <w:t>R#38, R#39 Destination Y Register</w:t>
         </w:r>
@@ -792,7 +792,7 @@
           <w:tab w:val="right" w:leader="dot" w:pos="9637"/>
         </w:tabs>
       </w:pPr>
-      <w:hyperlink r:id="rId41" w:history="1">
+      <w:hyperlink w:anchor="__RefHeading___Toc350_2656764749" w:history="1">
         <w:r>
           <w:t>R#40, R#41 Number Of Dots X Register</w:t>
         </w:r>
@@ -810,7 +810,7 @@
           <w:tab w:val="right" w:leader="dot" w:pos="9637"/>
         </w:tabs>
       </w:pPr>
-      <w:hyperlink r:id="rId42" w:history="1">
+      <w:hyperlink w:anchor="__RefHeading___Toc352_2656764749" w:history="1">
         <w:r>
           <w:t>R#42, R#43 Number Of Dots Y Register</w:t>
         </w:r>
@@ -828,7 +828,7 @@
           <w:tab w:val="right" w:leader="dot" w:pos="9637"/>
         </w:tabs>
       </w:pPr>
-      <w:hyperlink r:id="rId43" w:history="1">
+      <w:hyperlink w:anchor="__RefHeading___Toc354_2656764749" w:history="1">
         <w:r>
           <w:t>R#44 Color Register</w:t>
         </w:r>
@@ -846,7 +846,7 @@
           <w:tab w:val="right" w:leader="dot" w:pos="9637"/>
         </w:tabs>
       </w:pPr>
-      <w:hyperlink r:id="rId44" w:history="1">
+      <w:hyperlink w:anchor="__RefHeading___Toc356_2656764749" w:history="1">
         <w:r>
           <w:t>R#45 Argument Register</w:t>
         </w:r>
@@ -864,7 +864,7 @@
           <w:tab w:val="right" w:leader="dot" w:pos="9637"/>
         </w:tabs>
       </w:pPr>
-      <w:hyperlink r:id="rId45" w:history="1">
+      <w:hyperlink w:anchor="__RefHeading___Toc358_2656764749" w:history="1">
         <w:r>
           <w:t>R#46 Command Register</w:t>
         </w:r>
@@ -882,7 +882,7 @@
           <w:tab w:val="right" w:leader="dot" w:pos="9637"/>
         </w:tabs>
       </w:pPr>
-      <w:hyperlink r:id="rId46" w:history="1">
+      <w:hyperlink w:anchor="__RefHeading___Toc451_2656764749" w:history="1">
         <w:r>
           <w:t>R#47, R#48, R#49, R#50 Rotation unit vector</w:t>
         </w:r>
@@ -900,7 +900,7 @@
           <w:tab w:val="right" w:leader="dot" w:pos="9637"/>
         </w:tabs>
       </w:pPr>
-      <w:hyperlink r:id="rId47" w:history="1">
+      <w:hyperlink w:anchor="__RefHeading___Toc455_2656764749" w:history="1">
         <w:r>
           <w:t>R#51, R#52, R#53, R#54 Output window start</w:t>
         </w:r>
@@ -918,7 +918,7 @@
           <w:tab w:val="right" w:leader="dot" w:pos="9637"/>
         </w:tabs>
       </w:pPr>
-      <w:hyperlink r:id="rId48" w:history="1">
+      <w:hyperlink w:anchor="__RefHeading___Toc459_2656764749" w:history="1">
         <w:r>
           <w:t>R#55, R#56, R#57, R#58 Output window end</w:t>
         </w:r>
@@ -936,7 +936,7 @@
           <w:tab w:val="right" w:leader="dot" w:pos="9637"/>
         </w:tabs>
       </w:pPr>
-      <w:hyperlink r:id="rId49" w:history="1">
+      <w:hyperlink w:anchor="__RefHeading___Toc360_2656764749" w:history="1">
         <w:r>
           <w:t>ステータスレジスタ</w:t>
         </w:r>
@@ -954,7 +954,7 @@
           <w:tab w:val="right" w:leader="dot" w:pos="9637"/>
         </w:tabs>
       </w:pPr>
-      <w:hyperlink r:id="rId50" w:history="1">
+      <w:hyperlink w:anchor="__RefHeading___Toc362_2656764749" w:history="1">
         <w:r>
           <w:t>S#0 Status register 0</w:t>
         </w:r>
@@ -972,7 +972,7 @@
           <w:tab w:val="right" w:leader="dot" w:pos="9637"/>
         </w:tabs>
       </w:pPr>
-      <w:hyperlink r:id="rId51" w:history="1">
+      <w:hyperlink w:anchor="__RefHeading___Toc364_2656764749" w:history="1">
         <w:r>
           <w:t>S#1 Status register 1</w:t>
         </w:r>
@@ -990,7 +990,7 @@
           <w:tab w:val="right" w:leader="dot" w:pos="9637"/>
         </w:tabs>
       </w:pPr>
-      <w:hyperlink r:id="rId52" w:history="1">
+      <w:hyperlink w:anchor="__RefHeading___Toc366_2656764749" w:history="1">
         <w:r>
           <w:t>S#2 Status register 2</w:t>
         </w:r>
@@ -1008,7 +1008,7 @@
           <w:tab w:val="right" w:leader="dot" w:pos="9637"/>
         </w:tabs>
       </w:pPr>
-      <w:hyperlink r:id="rId53" w:history="1">
+      <w:hyperlink w:anchor="__RefHeading___Toc368_2656764749" w:history="1">
         <w:r>
           <w:t>S#3, S#4, S#5, S#6 Column/Row register</w:t>
         </w:r>
@@ -1026,7 +1026,7 @@
           <w:tab w:val="right" w:leader="dot" w:pos="9637"/>
         </w:tabs>
       </w:pPr>
-      <w:hyperlink r:id="rId54" w:history="1">
+      <w:hyperlink w:anchor="__RefHeading___Toc372_2656764749" w:history="1">
         <w:r>
           <w:t>S#7 Color register</w:t>
         </w:r>
@@ -1044,7 +1044,7 @@
           <w:tab w:val="right" w:leader="dot" w:pos="9637"/>
         </w:tabs>
       </w:pPr>
-      <w:hyperlink r:id="rId55" w:history="1">
+      <w:hyperlink w:anchor="__RefHeading___Toc374_2656764749" w:history="1">
         <w:r>
           <w:t>S#8, S#9 Border X register</w:t>
         </w:r>
@@ -1122,7 +1122,7 @@
                     <pic:cNvPicPr/>
                   </pic:nvPicPr>
                   <pic:blipFill>
-                    <a:blip r:embed="rId56">
+                    <a:blip r:embed="rId6">
                       <a:lum/>
                       <a:alphaModFix/>
                     </a:blip>
@@ -1196,7 +1196,7 @@
                     <pic:cNvPicPr/>
                   </pic:nvPicPr>
                   <pic:blipFill>
-                    <a:blip r:embed="rId57">
+                    <a:blip r:embed="rId7">
                       <a:lum/>
                       <a:alphaModFix/>
                     </a:blip>
@@ -1270,7 +1270,7 @@
                     <pic:cNvPicPr/>
                   </pic:nvPicPr>
                   <pic:blipFill>
-                    <a:blip r:embed="rId58">
+                    <a:blip r:embed="rId8">
                       <a:lum/>
                       <a:alphaModFix/>
                     </a:blip>
@@ -1372,7 +1372,7 @@
                     <pic:cNvPicPr/>
                   </pic:nvPicPr>
                   <pic:blipFill>
-                    <a:blip r:embed="rId59">
+                    <a:blip r:embed="rId9">
                       <a:lum/>
                       <a:alphaModFix/>
                     </a:blip>
@@ -1509,7 +1509,7 @@
                     <pic:cNvPicPr/>
                   </pic:nvPicPr>
                   <pic:blipFill>
-                    <a:blip r:embed="rId60">
+                    <a:blip r:embed="rId10">
                       <a:lum/>
                       <a:alphaModFix/>
                     </a:blip>
@@ -1647,12 +1647,6 @@
         <w:gridCol w:w="3213"/>
       </w:tblGrid>
       <w:tr>
-        <w:tblPrEx>
-          <w:tblCellMar>
-            <w:top w:w="0" w:type="dxa"/>
-            <w:bottom w:w="0" w:type="dxa"/>
-          </w:tblCellMar>
-        </w:tblPrEx>
         <w:tc>
           <w:tcPr>
             <w:tcW w:w="3797" w:type="dxa"/>
@@ -1734,12 +1728,6 @@
         </w:tc>
       </w:tr>
       <w:tr>
-        <w:tblPrEx>
-          <w:tblCellMar>
-            <w:top w:w="0" w:type="dxa"/>
-            <w:bottom w:w="0" w:type="dxa"/>
-          </w:tblCellMar>
-        </w:tblPrEx>
         <w:tc>
           <w:tcPr>
             <w:tcW w:w="3797" w:type="dxa"/>
@@ -1815,12 +1803,6 @@
         </w:tc>
       </w:tr>
       <w:tr>
-        <w:tblPrEx>
-          <w:tblCellMar>
-            <w:top w:w="0" w:type="dxa"/>
-            <w:bottom w:w="0" w:type="dxa"/>
-          </w:tblCellMar>
-        </w:tblPrEx>
         <w:tc>
           <w:tcPr>
             <w:tcW w:w="3797" w:type="dxa"/>
@@ -1896,12 +1878,6 @@
         </w:tc>
       </w:tr>
       <w:tr>
-        <w:tblPrEx>
-          <w:tblCellMar>
-            <w:top w:w="0" w:type="dxa"/>
-            <w:bottom w:w="0" w:type="dxa"/>
-          </w:tblCellMar>
-        </w:tblPrEx>
         <w:tc>
           <w:tcPr>
             <w:tcW w:w="3797" w:type="dxa"/>
@@ -1977,12 +1953,6 @@
         </w:tc>
       </w:tr>
       <w:tr>
-        <w:tblPrEx>
-          <w:tblCellMar>
-            <w:top w:w="0" w:type="dxa"/>
-            <w:bottom w:w="0" w:type="dxa"/>
-          </w:tblCellMar>
-        </w:tblPrEx>
         <w:tc>
           <w:tcPr>
             <w:tcW w:w="3797" w:type="dxa"/>
@@ -2058,12 +2028,6 @@
         </w:tc>
       </w:tr>
       <w:tr>
-        <w:tblPrEx>
-          <w:tblCellMar>
-            <w:top w:w="0" w:type="dxa"/>
-            <w:bottom w:w="0" w:type="dxa"/>
-          </w:tblCellMar>
-        </w:tblPrEx>
         <w:tc>
           <w:tcPr>
             <w:tcW w:w="3797" w:type="dxa"/>
@@ -2139,12 +2103,6 @@
         </w:tc>
       </w:tr>
       <w:tr>
-        <w:tblPrEx>
-          <w:tblCellMar>
-            <w:top w:w="0" w:type="dxa"/>
-            <w:bottom w:w="0" w:type="dxa"/>
-          </w:tblCellMar>
-        </w:tblPrEx>
         <w:tc>
           <w:tcPr>
             <w:tcW w:w="3797" w:type="dxa"/>
@@ -2220,12 +2178,6 @@
         </w:tc>
       </w:tr>
       <w:tr>
-        <w:tblPrEx>
-          <w:tblCellMar>
-            <w:top w:w="0" w:type="dxa"/>
-            <w:bottom w:w="0" w:type="dxa"/>
-          </w:tblCellMar>
-        </w:tblPrEx>
         <w:tc>
           <w:tcPr>
             <w:tcW w:w="3797" w:type="dxa"/>
@@ -2301,12 +2253,6 @@
         </w:tc>
       </w:tr>
       <w:tr>
-        <w:tblPrEx>
-          <w:tblCellMar>
-            <w:top w:w="0" w:type="dxa"/>
-            <w:bottom w:w="0" w:type="dxa"/>
-          </w:tblCellMar>
-        </w:tblPrEx>
         <w:tc>
           <w:tcPr>
             <w:tcW w:w="3797" w:type="dxa"/>
@@ -2382,12 +2328,6 @@
         </w:tc>
       </w:tr>
       <w:tr>
-        <w:tblPrEx>
-          <w:tblCellMar>
-            <w:top w:w="0" w:type="dxa"/>
-            <w:bottom w:w="0" w:type="dxa"/>
-          </w:tblCellMar>
-        </w:tblPrEx>
         <w:tc>
           <w:tcPr>
             <w:tcW w:w="3797" w:type="dxa"/>
@@ -2463,12 +2403,6 @@
         </w:tc>
       </w:tr>
       <w:tr>
-        <w:tblPrEx>
-          <w:tblCellMar>
-            <w:top w:w="0" w:type="dxa"/>
-            <w:bottom w:w="0" w:type="dxa"/>
-          </w:tblCellMar>
-        </w:tblPrEx>
         <w:tc>
           <w:tcPr>
             <w:tcW w:w="3797" w:type="dxa"/>
@@ -2600,7 +2534,7 @@
                     <pic:cNvPicPr/>
                   </pic:nvPicPr>
                   <pic:blipFill>
-                    <a:blip r:embed="rId61">
+                    <a:blip r:embed="rId11">
                       <a:lum/>
                       <a:alphaModFix/>
                     </a:blip>
@@ -2682,7 +2616,7 @@
                     <pic:cNvPicPr/>
                   </pic:nvPicPr>
                   <pic:blipFill>
-                    <a:blip r:embed="rId62">
+                    <a:blip r:embed="rId12">
                       <a:lum/>
                       <a:alphaModFix/>
                     </a:blip>
@@ -2756,7 +2690,7 @@
                     <pic:cNvPicPr/>
                   </pic:nvPicPr>
                   <pic:blipFill>
-                    <a:blip r:embed="rId63">
+                    <a:blip r:embed="rId13">
                       <a:lum/>
                       <a:alphaModFix/>
                     </a:blip>
@@ -2848,7 +2782,7 @@
                     <pic:cNvPicPr/>
                   </pic:nvPicPr>
                   <pic:blipFill>
-                    <a:blip r:embed="rId64">
+                    <a:blip r:embed="rId14">
                       <a:lum/>
                       <a:alphaModFix/>
                     </a:blip>
@@ -2915,7 +2849,7 @@
                     <pic:cNvPicPr/>
                   </pic:nvPicPr>
                   <pic:blipFill>
-                    <a:blip r:embed="rId65">
+                    <a:blip r:embed="rId15">
                       <a:lum/>
                       <a:alphaModFix/>
                     </a:blip>
@@ -2981,7 +2915,7 @@
                     <pic:cNvPicPr/>
                   </pic:nvPicPr>
                   <pic:blipFill>
-                    <a:blip r:embed="rId66">
+                    <a:blip r:embed="rId16">
                       <a:lum/>
                       <a:alphaModFix/>
                     </a:blip>
@@ -3055,7 +2989,7 @@
                     <pic:cNvPicPr/>
                   </pic:nvPicPr>
                   <pic:blipFill>
-                    <a:blip r:embed="rId67">
+                    <a:blip r:embed="rId17">
                       <a:lum/>
                       <a:alphaModFix/>
                     </a:blip>
@@ -3147,7 +3081,7 @@
                     <pic:cNvPicPr/>
                   </pic:nvPicPr>
                   <pic:blipFill>
-                    <a:blip r:embed="rId68">
+                    <a:blip r:embed="rId18">
                       <a:lum/>
                       <a:alphaModFix/>
                     </a:blip>
@@ -3227,7 +3161,7 @@
                     <pic:cNvPicPr/>
                   </pic:nvPicPr>
                   <pic:blipFill>
-                    <a:blip r:embed="rId69">
+                    <a:blip r:embed="rId19">
                       <a:lum/>
                       <a:alphaModFix/>
                     </a:blip>
@@ -3314,7 +3248,7 @@
                     <pic:cNvPicPr/>
                   </pic:nvPicPr>
                   <pic:blipFill>
-                    <a:blip r:embed="rId70">
+                    <a:blip r:embed="rId20">
                       <a:lum/>
                       <a:alphaModFix/>
                     </a:blip>
@@ -3380,7 +3314,7 @@
                     <pic:cNvPicPr/>
                   </pic:nvPicPr>
                   <pic:blipFill>
-                    <a:blip r:embed="rId71">
+                    <a:blip r:embed="rId21">
                       <a:lum/>
                       <a:alphaModFix/>
                     </a:blip>
@@ -3446,7 +3380,7 @@
                     <pic:cNvPicPr/>
                   </pic:nvPicPr>
                   <pic:blipFill>
-                    <a:blip r:embed="rId72">
+                    <a:blip r:embed="rId22">
                       <a:lum/>
                       <a:alphaModFix/>
                     </a:blip>
@@ -3512,7 +3446,7 @@
                     <pic:cNvPicPr/>
                   </pic:nvPicPr>
                   <pic:blipFill>
-                    <a:blip r:embed="rId73">
+                    <a:blip r:embed="rId23">
                       <a:lum/>
                       <a:alphaModFix/>
                     </a:blip>
@@ -3578,7 +3512,7 @@
                     <pic:cNvPicPr/>
                   </pic:nvPicPr>
                   <pic:blipFill>
-                    <a:blip r:embed="rId74">
+                    <a:blip r:embed="rId24">
                       <a:lum/>
                       <a:alphaModFix/>
                     </a:blip>
@@ -3645,7 +3579,7 @@
                     <pic:cNvPicPr/>
                   </pic:nvPicPr>
                   <pic:blipFill>
-                    <a:blip r:embed="rId75">
+                    <a:blip r:embed="rId25">
                       <a:lum/>
                       <a:alphaModFix/>
                     </a:blip>
@@ -3711,7 +3645,7 @@
                     <pic:cNvPicPr/>
                   </pic:nvPicPr>
                   <pic:blipFill>
-                    <a:blip r:embed="rId76">
+                    <a:blip r:embed="rId26">
                       <a:lum/>
                       <a:alphaModFix/>
                     </a:blip>
@@ -3777,7 +3711,7 @@
                     <pic:cNvPicPr/>
                   </pic:nvPicPr>
                   <pic:blipFill>
-                    <a:blip r:embed="rId77">
+                    <a:blip r:embed="rId27">
                       <a:lum/>
                       <a:alphaModFix/>
                     </a:blip>
@@ -3843,7 +3777,7 @@
                     <pic:cNvPicPr/>
                   </pic:nvPicPr>
                   <pic:blipFill>
-                    <a:blip r:embed="rId78">
+                    <a:blip r:embed="rId28">
                       <a:lum/>
                       <a:alphaModFix/>
                     </a:blip>
@@ -3909,7 +3843,7 @@
                     <pic:cNvPicPr/>
                   </pic:nvPicPr>
                   <pic:blipFill>
-                    <a:blip r:embed="rId79">
+                    <a:blip r:embed="rId29">
                       <a:lum/>
                       <a:alphaModFix/>
                     </a:blip>
@@ -3975,7 +3909,7 @@
                     <pic:cNvPicPr/>
                   </pic:nvPicPr>
                   <pic:blipFill>
-                    <a:blip r:embed="rId80">
+                    <a:blip r:embed="rId30">
                       <a:lum/>
                       <a:alphaModFix/>
                     </a:blip>
@@ -4042,7 +3976,7 @@
                     <pic:cNvPicPr/>
                   </pic:nvPicPr>
                   <pic:blipFill>
-                    <a:blip r:embed="rId81">
+                    <a:blip r:embed="rId31">
                       <a:lum/>
                       <a:alphaModFix/>
                     </a:blip>
@@ -4083,36 +4017,23 @@
         <w:pStyle w:val="Standard"/>
       </w:pPr>
       <w:r>
-        <w:rPr>
-          <w:noProof/>
-        </w:rPr>
         <w:drawing>
-          <wp:anchor distT="0" distB="0" distL="114300" distR="114300" simplePos="0" relativeHeight="20" behindDoc="0" locked="0" layoutInCell="1" allowOverlap="1" wp14:anchorId="400EEB24" wp14:editId="175F9827">
-            <wp:simplePos x="0" y="0"/>
-            <wp:positionH relativeFrom="column">
-              <wp:posOffset>0</wp:posOffset>
-            </wp:positionH>
-            <wp:positionV relativeFrom="paragraph">
-              <wp:posOffset>36720</wp:posOffset>
-            </wp:positionV>
-            <wp:extent cx="6120000" cy="775440"/>
-            <wp:effectExtent l="0" t="0" r="0" b="5610"/>
-            <wp:wrapSquare wrapText="bothSides"/>
-            <wp:docPr id="1761192523" name="画像22"/>
-            <wp:cNvGraphicFramePr/>
+          <wp:inline distT="0" distB="0" distL="0" distR="0" wp14:anchorId="24F0B2D7" wp14:editId="77914992">
+            <wp:extent cx="6120130" cy="777240"/>
+            <wp:effectExtent l="0" t="0" r="0" b="3810"/>
+            <wp:docPr id="1974623089" name="図 1" descr="The image appears to be a visual representation of a digital circuit or memory matrix, displaying a series of bits and associated labels such as 'R#20', 'S16', and various control signals like 'CEIE' and 'HS'.&#10;&#10;AI 生成コンテンツは誤りを含む可能性があります。"/>
+            <wp:cNvGraphicFramePr>
+              <a:graphicFrameLocks xmlns:a="http://schemas.openxmlformats.org/drawingml/2006/main" noChangeAspect="1"/>
+            </wp:cNvGraphicFramePr>
             <a:graphic xmlns:a="http://schemas.openxmlformats.org/drawingml/2006/main">
               <a:graphicData uri="http://schemas.openxmlformats.org/drawingml/2006/picture">
                 <pic:pic xmlns:pic="http://schemas.openxmlformats.org/drawingml/2006/picture">
                   <pic:nvPicPr>
-                    <pic:cNvPr id="0" name=""/>
+                    <pic:cNvPr id="1974623089" name="図 1" descr="The image appears to be a visual representation of a digital circuit or memory matrix, displaying a series of bits and associated labels such as 'R#20', 'S16', and various control signals like 'CEIE' and 'HS'.&#10;&#10;AI 生成コンテンツは誤りを含む可能性があります。"/>
                     <pic:cNvPicPr/>
                   </pic:nvPicPr>
                   <pic:blipFill>
-                    <a:blip r:embed="rId82">
-                      <a:lum/>
-                      <a:alphaModFix/>
-                    </a:blip>
-                    <a:srcRect/>
+                    <a:blip r:embed="rId32"/>
                     <a:stretch>
                       <a:fillRect/>
                     </a:stretch>
@@ -4120,17 +4041,16 @@
                   <pic:spPr>
                     <a:xfrm>
                       <a:off x="0" y="0"/>
-                      <a:ext cx="6120000" cy="775440"/>
+                      <a:ext cx="6120130" cy="777240"/>
                     </a:xfrm>
                     <a:prstGeom prst="rect">
                       <a:avLst/>
                     </a:prstGeom>
-                    <a:noFill/>
                   </pic:spPr>
                 </pic:pic>
               </a:graphicData>
             </a:graphic>
-          </wp:anchor>
+          </wp:inline>
         </w:drawing>
       </w:r>
     </w:p>
@@ -4179,39 +4099,23 @@
         <w:pStyle w:val="Standard"/>
       </w:pPr>
       <w:r>
-        <w:t xml:space="preserve">EPAL (Expanded </w:t>
-      </w:r>
-      <w:proofErr w:type="spellStart"/>
-      <w:r>
-        <w:t>PALette</w:t>
-      </w:r>
-      <w:proofErr w:type="spellEnd"/>
-      <w:r>
-        <w:t>) : 1 にすると、32768色から選択するパレットに切り替わる。</w:t>
-      </w:r>
-    </w:p>
-    <w:p>
-      <w:pPr>
-        <w:pStyle w:val="Standard"/>
-      </w:pPr>
-      <w:r>
-        <w:t xml:space="preserve">ECOM (Expanded VDP </w:t>
-      </w:r>
-      <w:proofErr w:type="spellStart"/>
-      <w:r>
-        <w:t>COMmand</w:t>
-      </w:r>
-      <w:proofErr w:type="spellEnd"/>
-      <w:r>
-        <w:t>) : 1 にすると、新しいVDPコマンドを利用可能になる。</w:t>
-      </w:r>
-    </w:p>
-    <w:p>
-      <w:pPr>
-        <w:pStyle w:val="Standard"/>
-      </w:pPr>
-      <w:r>
-        <w:t>EVR (Expanded VRAM) : VRAM 256KB に拡張する。</w:t>
+        <w:t>EPAL (Expanded PALette) : 1 にすると、32768色から選択するパレットに切り替わる。</w:t>
+      </w:r>
+    </w:p>
+    <w:p>
+      <w:pPr>
+        <w:pStyle w:val="Standard"/>
+      </w:pPr>
+      <w:r>
+        <w:t>FIL (Flat InterLace mode) : 1にすると、インターレースによる疑似垂直高解像度表示時に、VRAM の並びをフラットに扱うように変更した新しいインターレースモードにする。R#9 の設定よりもこちらの設定の方が優先。</w:t>
+      </w:r>
+    </w:p>
+    <w:p>
+      <w:pPr>
+        <w:pStyle w:val="Standard"/>
+      </w:pPr>
+      <w:r>
+        <w:t>CEIE (Command execute End Interrupt Enable) : VDPコマンド実行完了割り込みのイネーブラ。</w:t>
       </w:r>
     </w:p>
     <w:p>
@@ -4229,11 +4133,6 @@
     </w:p>
     <w:p>
       <w:pPr>
-        <w:pStyle w:val="Standard"/>
-      </w:pPr>
-    </w:p>
-    <w:p>
-      <w:pPr>
         <w:pStyle w:val="2"/>
       </w:pPr>
       <w:bookmarkStart w:id="23" w:name="__RefHeading___Toc326_2656764749"/>
@@ -4247,36 +4146,23 @@
         <w:pStyle w:val="Standard"/>
       </w:pPr>
       <w:r>
-        <w:rPr>
-          <w:noProof/>
-        </w:rPr>
         <w:drawing>
-          <wp:anchor distT="0" distB="0" distL="114300" distR="114300" simplePos="0" relativeHeight="49" behindDoc="0" locked="0" layoutInCell="1" allowOverlap="1" wp14:anchorId="495CBC00" wp14:editId="05A52FCF">
-            <wp:simplePos x="0" y="0"/>
-            <wp:positionH relativeFrom="column">
-              <wp:posOffset>0</wp:posOffset>
-            </wp:positionH>
-            <wp:positionV relativeFrom="paragraph">
-              <wp:posOffset>-14760</wp:posOffset>
-            </wp:positionV>
-            <wp:extent cx="6120000" cy="813960"/>
-            <wp:effectExtent l="0" t="0" r="0" b="5190"/>
-            <wp:wrapSquare wrapText="bothSides"/>
-            <wp:docPr id="1668893801" name="画像23"/>
-            <wp:cNvGraphicFramePr/>
+          <wp:inline distT="0" distB="0" distL="0" distR="0" wp14:anchorId="1297AE37" wp14:editId="07B1F553">
+            <wp:extent cx="6120130" cy="793115"/>
+            <wp:effectExtent l="0" t="0" r="0" b="6985"/>
+            <wp:docPr id="716908500" name="図 1" descr="The image displays a sequence of bits, starting with bit7 down to bit0, followed by R#21 and V58, with a pattern of zeros and ones.&#10;&#10;AI 生成コンテンツは誤りを含む可能性があります。"/>
+            <wp:cNvGraphicFramePr>
+              <a:graphicFrameLocks xmlns:a="http://schemas.openxmlformats.org/drawingml/2006/main" noChangeAspect="1"/>
+            </wp:cNvGraphicFramePr>
             <a:graphic xmlns:a="http://schemas.openxmlformats.org/drawingml/2006/main">
               <a:graphicData uri="http://schemas.openxmlformats.org/drawingml/2006/picture">
                 <pic:pic xmlns:pic="http://schemas.openxmlformats.org/drawingml/2006/picture">
                   <pic:nvPicPr>
-                    <pic:cNvPr id="0" name=""/>
+                    <pic:cNvPr id="716908500" name="図 1" descr="The image displays a sequence of bits, starting with bit7 down to bit0, followed by R#21 and V58, with a pattern of zeros and ones.&#10;&#10;AI 生成コンテンツは誤りを含む可能性があります。"/>
                     <pic:cNvPicPr/>
                   </pic:nvPicPr>
                   <pic:blipFill>
-                    <a:blip r:embed="rId83">
-                      <a:lum/>
-                      <a:alphaModFix/>
-                    </a:blip>
-                    <a:srcRect/>
+                    <a:blip r:embed="rId33"/>
                     <a:stretch>
                       <a:fillRect/>
                     </a:stretch>
@@ -4284,17 +4170,16 @@
                   <pic:spPr>
                     <a:xfrm>
                       <a:off x="0" y="0"/>
-                      <a:ext cx="6120000" cy="813960"/>
+                      <a:ext cx="6120130" cy="793115"/>
                     </a:xfrm>
                     <a:prstGeom prst="rect">
                       <a:avLst/>
                     </a:prstGeom>
-                    <a:noFill/>
                   </pic:spPr>
                 </pic:pic>
               </a:graphicData>
             </a:graphic>
-          </wp:anchor>
+          </wp:inline>
         </w:drawing>
       </w:r>
     </w:p>
@@ -4311,53 +4196,79 @@
         <w:pStyle w:val="Standard"/>
       </w:pPr>
       <w:r>
-        <w:t>FID (</w:t>
-      </w:r>
-      <w:proofErr w:type="spellStart"/>
-      <w:r>
-        <w:t>FakeID</w:t>
-      </w:r>
-      <w:proofErr w:type="spellEnd"/>
-      <w:r>
-        <w:t>): 1 にすると VDP ID が V9958 (00010) になる。デフォルトは 1。0 にすると VDP ID が V9968 (00011) になる。（※VDP ID は S#1）</w:t>
-      </w:r>
-    </w:p>
-    <w:p>
-      <w:pPr>
-        <w:pStyle w:val="Standard"/>
-      </w:pPr>
-      <w:r>
-        <w:t xml:space="preserve">FIL (Flat </w:t>
-      </w:r>
-      <w:proofErr w:type="spellStart"/>
-      <w:r>
-        <w:t>InterLace</w:t>
-      </w:r>
-      <w:proofErr w:type="spellEnd"/>
-      <w:r>
-        <w:t xml:space="preserve"> mode) : 1にすると、インターレースによる疑似垂直高解像度表示時に、VRAM の並びをフラットに扱うように変更した新しいインターレースモードにする。R#9 の設定よりもこちらの設定の方が優先。</w:t>
-      </w:r>
-    </w:p>
-    <w:p>
-      <w:pPr>
-        <w:pStyle w:val="Standard"/>
-      </w:pPr>
+        <w:rPr>
+          <w:rFonts w:hint="eastAsia"/>
+        </w:rPr>
+        <w:t>V58</w:t>
+      </w:r>
+      <w:r>
+        <w:t xml:space="preserve"> (</w:t>
+      </w:r>
+      <w:r>
+        <w:rPr>
+          <w:rFonts w:hint="eastAsia"/>
+        </w:rPr>
+        <w:t>V9958 Compatible</w:t>
+      </w:r>
+      <w:r>
+        <w:t>): 1 にすると VDP ID が V9958 (00010) になる。デフォルトは 1。</w:t>
+      </w:r>
+    </w:p>
+    <w:p>
+      <w:pPr>
+        <w:pStyle w:val="Standard"/>
+      </w:pPr>
+      <w:r>
+        <w:t>0 にすると VDP ID が V9968 (00011) にな</w:t>
+      </w:r>
+      <w:r>
+        <w:rPr>
+          <w:rFonts w:hint="eastAsia"/>
+        </w:rPr>
+        <w:t>り</w:t>
+      </w:r>
+      <w:r>
+        <w:t>（※VDP ID は S#1）</w:t>
+      </w:r>
+      <w:r>
+        <w:rPr>
+          <w:rFonts w:hint="eastAsia"/>
+        </w:rPr>
+        <w:t>、</w:t>
+      </w:r>
+    </w:p>
+    <w:p>
+      <w:pPr>
+        <w:pStyle w:val="Standard"/>
+      </w:pPr>
+      <w:r>
+        <w:t>新しいVDPコマンドを利用可能にな</w:t>
+      </w:r>
+      <w:r>
+        <w:rPr>
+          <w:rFonts w:hint="eastAsia"/>
+        </w:rPr>
+        <w:t>り、</w:t>
+      </w:r>
+      <w:r>
+        <w:t>VRAM 256KB に拡張する。</w:t>
+      </w:r>
+    </w:p>
+    <w:p>
+      <w:pPr>
+        <w:pStyle w:val="Standard"/>
+        <w:rPr>
+          <w:rFonts w:hint="eastAsia"/>
+        </w:rPr>
+      </w:pPr>
+    </w:p>
+    <w:p>
+      <w:pPr>
+        <w:pStyle w:val="2"/>
+      </w:pPr>
+      <w:bookmarkStart w:id="24" w:name="__RefHeading___Toc328_2656764749"/>
       <w:r>
         <w:lastRenderedPageBreak/>
-        <w:t>CEIE (Command execute End Interrupt Enable) : VDPコマンド実行完了割り込みのイネーブラ。</w:t>
-      </w:r>
-    </w:p>
-    <w:p>
-      <w:pPr>
-        <w:pStyle w:val="Standard"/>
-      </w:pPr>
-    </w:p>
-    <w:p>
-      <w:pPr>
-        <w:pStyle w:val="2"/>
-      </w:pPr>
-      <w:bookmarkStart w:id="24" w:name="__RefHeading___Toc328_2656764749"/>
-      <w:r>
         <w:t>R#22 N/A</w:t>
       </w:r>
       <w:bookmarkEnd w:id="24"/>
@@ -4392,7 +4303,7 @@
                     <pic:cNvPicPr/>
                   </pic:nvPicPr>
                   <pic:blipFill>
-                    <a:blip r:embed="rId84">
+                    <a:blip r:embed="rId34">
                       <a:lum/>
                       <a:alphaModFix/>
                     </a:blip>
@@ -4458,7 +4369,7 @@
                     <pic:cNvPicPr/>
                   </pic:nvPicPr>
                   <pic:blipFill>
-                    <a:blip r:embed="rId85">
+                    <a:blip r:embed="rId35">
                       <a:lum/>
                       <a:alphaModFix/>
                     </a:blip>
@@ -4547,7 +4458,7 @@
                     <pic:cNvPicPr/>
                   </pic:nvPicPr>
                   <pic:blipFill>
-                    <a:blip r:embed="rId86">
+                    <a:blip r:embed="rId36">
                       <a:lum/>
                       <a:alphaModFix/>
                     </a:blip>
@@ -4602,15 +4513,7 @@
         <w:pStyle w:val="Standard"/>
       </w:pPr>
       <w:r>
-        <w:t>YAE (Y Attribute Enable) : 1 にすると</w:t>
-      </w:r>
-      <w:proofErr w:type="spellStart"/>
-      <w:r>
-        <w:t>YJK+Palette</w:t>
-      </w:r>
-      <w:proofErr w:type="spellEnd"/>
-      <w:r>
-        <w:t>のハイブリッドモードに切り替える。Graphic7 で、かつ YJK=1 である必要がある。その他のモードでの動作は保証しない。</w:t>
+        <w:t>YAE (Y Attribute Enable) : 1 にするとYJK+Paletteのハイブリッドモードに切り替える。Graphic7 で、かつ YJK=1 である必要がある。その他のモードでの動作は保証しない。</w:t>
       </w:r>
     </w:p>
     <w:p>
@@ -4640,7 +4543,6 @@
       </w:pPr>
       <w:bookmarkStart w:id="28" w:name="__RefHeading___Toc336_2656764749"/>
       <w:r>
-        <w:lastRenderedPageBreak/>
         <w:t>R#26 Horizontal Offset Register (By Character Units)</w:t>
       </w:r>
       <w:bookmarkEnd w:id="28"/>
@@ -4675,7 +4577,7 @@
                     <pic:cNvPicPr/>
                   </pic:nvPicPr>
                   <pic:blipFill>
-                    <a:blip r:embed="rId87">
+                    <a:blip r:embed="rId37">
                       <a:lum/>
                       <a:alphaModFix/>
                     </a:blip>
@@ -4707,6 +4609,7 @@
       </w:pPr>
       <w:bookmarkStart w:id="29" w:name="__RefHeading___Toc338_2656764749"/>
       <w:r>
+        <w:lastRenderedPageBreak/>
         <w:t>R#27 Horizontal Offset Register (By Dot Units)</w:t>
       </w:r>
       <w:bookmarkEnd w:id="29"/>
@@ -4741,7 +4644,7 @@
                     <pic:cNvPicPr/>
                   </pic:nvPicPr>
                   <pic:blipFill>
-                    <a:blip r:embed="rId88">
+                    <a:blip r:embed="rId38">
                       <a:lum/>
                       <a:alphaModFix/>
                     </a:blip>
@@ -4827,7 +4730,7 @@
                     <pic:cNvPicPr/>
                   </pic:nvPicPr>
                   <pic:blipFill>
-                    <a:blip r:embed="rId89">
+                    <a:blip r:embed="rId39">
                       <a:lum/>
                       <a:alphaModFix/>
                     </a:blip>
@@ -4903,7 +4806,7 @@
                     <pic:cNvPicPr/>
                   </pic:nvPicPr>
                   <pic:blipFill>
-                    <a:blip r:embed="rId90">
+                    <a:blip r:embed="rId40">
                       <a:lum/>
                       <a:alphaModFix/>
                     </a:blip>
@@ -4950,6 +4853,7 @@
       </w:pPr>
       <w:bookmarkStart w:id="33" w:name="__RefHeading___Toc346_2656764749"/>
       <w:r>
+        <w:lastRenderedPageBreak/>
         <w:t>R#36, R#37 Destination X Register</w:t>
       </w:r>
       <w:bookmarkEnd w:id="33"/>
@@ -4984,7 +4888,7 @@
                     <pic:cNvPicPr/>
                   </pic:nvPicPr>
                   <pic:blipFill>
-                    <a:blip r:embed="rId91">
+                    <a:blip r:embed="rId41">
                       <a:lum/>
                       <a:alphaModFix/>
                     </a:blip>
@@ -5070,7 +4974,7 @@
                     <pic:cNvPicPr/>
                   </pic:nvPicPr>
                   <pic:blipFill>
-                    <a:blip r:embed="rId92">
+                    <a:blip r:embed="rId42">
                       <a:lum/>
                       <a:alphaModFix/>
                     </a:blip>
@@ -5156,7 +5060,7 @@
                     <pic:cNvPicPr/>
                   </pic:nvPicPr>
                   <pic:blipFill>
-                    <a:blip r:embed="rId93">
+                    <a:blip r:embed="rId43">
                       <a:lum/>
                       <a:alphaModFix/>
                     </a:blip>
@@ -5208,6 +5112,7 @@
       </w:pPr>
       <w:bookmarkStart w:id="36" w:name="__RefHeading___Toc352_2656764749"/>
       <w:r>
+        <w:lastRenderedPageBreak/>
         <w:t>R#42, R#43 Number Of Dots Y Register</w:t>
       </w:r>
       <w:bookmarkEnd w:id="36"/>
@@ -5242,7 +5147,7 @@
                     <pic:cNvPicPr/>
                   </pic:nvPicPr>
                   <pic:blipFill>
-                    <a:blip r:embed="rId94">
+                    <a:blip r:embed="rId44">
                       <a:lum/>
                       <a:alphaModFix/>
                     </a:blip>
@@ -5328,7 +5233,7 @@
                     <pic:cNvPicPr/>
                   </pic:nvPicPr>
                   <pic:blipFill>
-                    <a:blip r:embed="rId95">
+                    <a:blip r:embed="rId45">
                       <a:lum/>
                       <a:alphaModFix/>
                     </a:blip>
@@ -5409,7 +5314,7 @@
                     <pic:cNvPicPr/>
                   </pic:nvPicPr>
                   <pic:blipFill>
-                    <a:blip r:embed="rId96">
+                    <a:blip r:embed="rId46">
                       <a:lum/>
                       <a:alphaModFix/>
                     </a:blip>
@@ -5448,15 +5353,7 @@
         <w:pStyle w:val="Standard"/>
       </w:pPr>
       <w:r>
-        <w:t xml:space="preserve">MXC : 従来の裏VRAM に対応したソフトのためのダミーレジスタである。1を立てると、表VRAMに対してCPUからアクセス出来なくなる。VRAM読みだし結果は </w:t>
-      </w:r>
-      <w:proofErr w:type="spellStart"/>
-      <w:r>
-        <w:t>FFh</w:t>
-      </w:r>
-      <w:proofErr w:type="spellEnd"/>
-      <w:r>
-        <w:t xml:space="preserve"> になる。ECOM=0 の場合にのみ有効。</w:t>
+        <w:t>MXC : 従来の裏VRAM に対応したソフトのためのダミーレジスタである。1を立てると、表VRAMに対してCPUからアクセス出来なくなる。VRAM読みだし結果は FFh になる。ECOM=0 の場合にのみ有効。</w:t>
       </w:r>
     </w:p>
     <w:p>
@@ -5518,7 +5415,7 @@
                     <pic:cNvPicPr/>
                   </pic:nvPicPr>
                   <pic:blipFill>
-                    <a:blip r:embed="rId97">
+                    <a:blip r:embed="rId47">
                       <a:lum/>
                       <a:alphaModFix/>
                     </a:blip>
@@ -5609,7 +5506,7 @@
                     <pic:cNvPicPr/>
                   </pic:nvPicPr>
                   <pic:blipFill>
-                    <a:blip r:embed="rId98">
+                    <a:blip r:embed="rId48">
                       <a:lum/>
                       <a:alphaModFix/>
                     </a:blip>
@@ -5689,7 +5586,7 @@
                     <pic:cNvPicPr/>
                   </pic:nvPicPr>
                   <pic:blipFill>
-                    <a:blip r:embed="rId99">
+                    <a:blip r:embed="rId49">
                       <a:lum/>
                       <a:alphaModFix/>
                     </a:blip>
@@ -5763,7 +5660,7 @@
                     <pic:cNvPicPr/>
                   </pic:nvPicPr>
                   <pic:blipFill>
-                    <a:blip r:embed="rId100">
+                    <a:blip r:embed="rId50">
                       <a:lum/>
                       <a:alphaModFix/>
                     </a:blip>
@@ -5857,7 +5754,7 @@
                     <pic:cNvPicPr/>
                   </pic:nvPicPr>
                   <pic:blipFill>
-                    <a:blip r:embed="rId101">
+                    <a:blip r:embed="rId51">
                       <a:lum/>
                       <a:alphaModFix/>
                     </a:blip>
@@ -5960,7 +5857,7 @@
                     <pic:cNvPicPr/>
                   </pic:nvPicPr>
                   <pic:blipFill>
-                    <a:blip r:embed="rId102">
+                    <a:blip r:embed="rId52">
                       <a:lum/>
                       <a:alphaModFix/>
                     </a:blip>
@@ -6088,7 +5985,7 @@
                     <pic:cNvPicPr/>
                   </pic:nvPicPr>
                   <pic:blipFill>
-                    <a:blip r:embed="rId103">
+                    <a:blip r:embed="rId53">
                       <a:lum/>
                       <a:alphaModFix/>
                     </a:blip>
@@ -6207,7 +6104,7 @@
                     <pic:cNvPicPr/>
                   </pic:nvPicPr>
                   <pic:blipFill>
-                    <a:blip r:embed="rId104">
+                    <a:blip r:embed="rId54">
                       <a:lum/>
                       <a:alphaModFix/>
                     </a:blip>
@@ -6296,7 +6193,7 @@
                     <pic:cNvPicPr/>
                   </pic:nvPicPr>
                   <pic:blipFill>
-                    <a:blip r:embed="rId105">
+                    <a:blip r:embed="rId55">
                       <a:lum/>
                       <a:alphaModFix/>
                     </a:blip>
@@ -6375,7 +6272,7 @@
                     <pic:cNvPicPr/>
                   </pic:nvPicPr>
                   <pic:blipFill>
-                    <a:blip r:embed="rId106">
+                    <a:blip r:embed="rId56">
                       <a:lum/>
                       <a:alphaModFix/>
                     </a:blip>
@@ -6430,8 +6327,8 @@
       </w:pPr>
     </w:p>
     <w:sectPr>
-      <w:headerReference w:type="default" r:id="rId107"/>
-      <w:footerReference w:type="default" r:id="rId108"/>
+      <w:headerReference w:type="default" r:id="rId57"/>
+      <w:footerReference w:type="default" r:id="rId58"/>
       <w:pgSz w:w="11906" w:h="16838"/>
       <w:pgMar w:top="1134" w:right="1134" w:bottom="1134" w:left="1134" w:header="720" w:footer="720" w:gutter="0"/>
       <w:cols w:space="720"/>

</xml_diff>